<commit_message>
Ajuste valores tecnicos e contrato doc
</commit_message>
<xml_diff>
--- a/CONTRATO DE LICENÇA DE USO DE SOFTWARE E PRESTAÇÃO DE SERVIÇOS.docx
+++ b/CONTRATO DE LICENÇA DE USO DE SOFTWARE E PRESTAÇÃO DE SERVIÇOS.docx
@@ -26,7 +26,7 @@
         <w:t>CONTRATANTE:</w:t>
       </w:r>
       <w:r>
-        <w:t xml:space="preserve"> ________________________________________________, condomínio localizado à ________________________________________________, neste ato representado por seu síndico/representante legal, ________________________________________________.</w:t>
+        <w:t xml:space="preserve"> _____________________________________________________________, condomínio localizado à _____________________________________________________________, neste ato representado por seu síndico/representante legal, _____________________________________________________________.</w:t>
       </w:r>
     </w:p>
     <w:p>
@@ -38,746 +38,517 @@
         <w:t>CONTRATADO:</w:t>
       </w:r>
       <w:r>
-        <w:t xml:space="preserve"> </w:t>
-      </w:r>
-      <w:r>
-        <w:rPr>
-          <w:b/>
-          <w:bCs/>
-        </w:rPr>
+        <w:t xml:space="preserve"> Marlon dos Santos Lima, inscrito no CPF sob o nº 406.393.288-9, doravante denominado simplesmente CONTRATADO.</w:t>
+      </w:r>
+    </w:p>
+    <w:p>
+      <w:r>
+        <w:t>As partes acima identificadas celebram o presente Contrato de Licença de Uso de Software e Prestação de Serviços, mediante as cláusulas seguintes.</w:t>
+      </w:r>
+    </w:p>
+    <w:p>
+      <w:pPr>
+        <w:rPr>
+          <w:b/>
+          <w:bCs/>
+        </w:rPr>
+      </w:pPr>
+      <w:r>
+        <w:rPr>
+          <w:b/>
+          <w:bCs/>
+        </w:rPr>
+        <w:t>1. OBJETO</w:t>
+      </w:r>
+    </w:p>
+    <w:p>
+      <w:r>
+        <w:t xml:space="preserve">1.1. O presente contrato tem como objeto a disponibilização, pelo CONTRATADO, do sistema de gerenciamento e apoio às atividades de portaria denominado </w:t>
+      </w:r>
+      <w:r>
+        <w:rPr>
+          <w:b/>
+          <w:bCs/>
+        </w:rPr>
+        <w:t>Vision+</w:t>
+      </w:r>
+      <w:r>
+        <w:t>, para uso exclusivo do CONTRATANTE.</w:t>
+      </w:r>
+      <w:r>
+        <w:br/>
+        <w:t>1.2. O sistema contempla funcionalidades como cadastro e gerenciamento de moradores, visitantes, veículos, encomendas e registros de acessos à portaria.</w:t>
+      </w:r>
+      <w:r>
+        <w:br/>
+        <w:t>1.3. O CONTRATADO concede ao CONTRATANTE uma licença de uso temporária, não exclusiva e intransferível do software durante a vigência deste instrumento.</w:t>
+      </w:r>
+      <w:r>
+        <w:br/>
+        <w:t>1.4. A licença é limitada e não implica transferência de propriedade intelectual, cessão de código-fonte ou direitos autorais sobre o software.</w:t>
+      </w:r>
+    </w:p>
+    <w:p>
+      <w:pPr>
+        <w:rPr>
+          <w:b/>
+          <w:bCs/>
+        </w:rPr>
+      </w:pPr>
+      <w:r>
+        <w:rPr>
+          <w:b/>
+          <w:bCs/>
+        </w:rPr>
+        <w:t>2. IMPLANTAÇÃO E PARCELAMENTO</w:t>
+      </w:r>
+    </w:p>
+    <w:p>
+      <w:r>
+        <w:t xml:space="preserve">2.1. Pela implantação, configuração inicial do ambiente em nuvem, migração inicial de dados e treinamento da equipe, o CONTRATANTE pagará ao CONTRATADO o valor único de </w:t>
+      </w:r>
+      <w:r>
+        <w:rPr>
+          <w:b/>
+          <w:bCs/>
+        </w:rPr>
+        <w:t>R$ 3.000,00 (três mil reais)</w:t>
+      </w:r>
+      <w:r>
+        <w:t>.</w:t>
+      </w:r>
+      <w:r>
+        <w:br/>
+        <w:t xml:space="preserve">2.2. O CONTRATADO permite, por mera liberalidade, o parcelamento do valor de implantação em até </w:t>
+      </w:r>
+      <w:r>
+        <w:rPr>
+          <w:b/>
+          <w:bCs/>
+        </w:rPr>
+        <w:t>3 (três) parcelas iguais e sucessivas de R$ 1.000,00 (um mil reais)</w:t>
+      </w:r>
+      <w:r>
+        <w:t>, a serem pagas cumulativamente com as 3 (três) primeiras mensalidades do software.</w:t>
+      </w:r>
+      <w:r>
+        <w:br/>
+        <w:t>2.3. Serviços adicionais, visitas presenciais extras ou integrações com hardwares de terceiros não previstos no escopo inicial deverão ser orçados e negociados separadamente.</w:t>
+      </w:r>
+    </w:p>
+    <w:p>
+      <w:pPr>
+        <w:rPr>
+          <w:b/>
+          <w:bCs/>
+        </w:rPr>
+      </w:pPr>
+      <w:r>
+        <w:rPr>
+          <w:b/>
+          <w:bCs/>
+        </w:rPr>
+        <w:t>3. VALORES E MENSALIDADE</w:t>
+      </w:r>
+    </w:p>
+    <w:p>
+      <w:r>
+        <w:t xml:space="preserve">3.1. Pela licença de uso do sistema, hospedagem do banco de dados e suporte técnico, o CONTRATANTE pagará ao CONTRATADO a mensalidade fixa de </w:t>
+      </w:r>
+      <w:r>
+        <w:rPr>
+          <w:b/>
+          <w:bCs/>
+        </w:rPr>
+        <w:t xml:space="preserve">R$ </w:t>
+      </w:r>
+      <w:r>
+        <w:rPr>
+          <w:b/>
+          <w:bCs/>
+        </w:rPr>
+        <w:t>______</w:t>
+      </w:r>
+      <w:r>
+        <w:rPr>
+          <w:b/>
+          <w:bCs/>
+        </w:rPr>
+        <w:t>(trezentos reais)</w:t>
+      </w:r>
+      <w:r>
+        <w:t>.</w:t>
+      </w:r>
+      <w:r>
+        <w:br/>
+        <w:t>3.2. Os pagamentos deverão ser realizados mensalmente via boleto bancário ou PIX, com vencimento no dia ____ de cada mês.</w:t>
+      </w:r>
+      <w:r>
+        <w:br/>
+      </w:r>
+      <w:r>
+        <w:lastRenderedPageBreak/>
+        <w:t xml:space="preserve">3.3. Durante os 3 (três) primeiros meses de vigência, o valor cobrado será de </w:t>
+      </w:r>
+      <w:r>
+        <w:rPr>
+          <w:b/>
+          <w:bCs/>
+        </w:rPr>
+        <w:t>R$ 1.300,00 (um mil trezentos reais)</w:t>
+      </w:r>
+      <w:r>
+        <w:t>, correspondente à soma da mensalidade (R$ 300,00) com a parcela da taxa de implantação (R$ 1.000,00). A partir do 4º mês, a cobrança assumirá o valor regular de R$ 300,00.</w:t>
+      </w:r>
+    </w:p>
+    <w:p>
+      <w:pPr>
+        <w:rPr>
+          <w:b/>
+          <w:bCs/>
+        </w:rPr>
+      </w:pPr>
+      <w:r>
+        <w:rPr>
+          <w:b/>
+          <w:bCs/>
+        </w:rPr>
+        <w:t>4. PRAZO DE ARREPENDIMENTO E GARANTIA DE REEMBOLSO</w:t>
+      </w:r>
+    </w:p>
+    <w:p>
+      <w:r>
+        <w:t xml:space="preserve">4.1. O CONTRATANTE dispõe de um prazo de </w:t>
+      </w:r>
+      <w:r>
+        <w:rPr>
+          <w:b/>
+          <w:bCs/>
+        </w:rPr>
+        <w:t>15 (quinze) dias corridos</w:t>
+      </w:r>
+      <w:r>
+        <w:t>, contados a partir da data de assinatura deste contrato, para testar o sistema e avaliar a adaptação da portaria.</w:t>
+      </w:r>
+      <w:r>
+        <w:br/>
+        <w:t>4.2. Caso o CONTRATANTE decida cancelar o serviço dentro deste período de 15 dias, deverá notificar o CONTRATADO formalmente por escrito (via e-mail ou canal oficial de suporte).</w:t>
+      </w:r>
+      <w:r>
+        <w:br/>
+        <w:t xml:space="preserve">4.3. Exercido o direito de arrependimento dentro do prazo estabelecido, o contrato será rescindido sem aplicação de multa, e o CONTRATADO realizará a </w:t>
+      </w:r>
+      <w:r>
+        <w:rPr>
+          <w:b/>
+          <w:bCs/>
+        </w:rPr>
+        <w:t>devolução de 80% (oitenta por cento) do valor total já pago</w:t>
+      </w:r>
+      <w:r>
+        <w:t xml:space="preserve"> na primeira cobrança. Os 20% (vinte por cento) restantes serão retidos pelo CONTRATADO para cobrir os custos operacionais de abertura de banco de dados, emissão de taxas e horas técnicas de configuração inicial.</w:t>
+      </w:r>
+      <w:r>
+        <w:br/>
+        <w:t>4.4. Imediatamente após a formalização do pedido de cancelamento previsto nesta cláusula, o acesso do CONTRATANTE ao sistema Vision+ será bloqueado.</w:t>
+      </w:r>
+    </w:p>
+    <w:p>
+      <w:pPr>
+        <w:rPr>
+          <w:b/>
+          <w:bCs/>
+        </w:rPr>
+      </w:pPr>
+      <w:r>
+        <w:rPr>
+          <w:b/>
+          <w:bCs/>
+        </w:rPr>
+        <w:t>5. VIGÊNCIA E FIDELIDADE</w:t>
+      </w:r>
+    </w:p>
+    <w:p>
+      <w:r>
+        <w:t xml:space="preserve">5.1. Transcorrido o prazo de garantia de 15 (quinze) dias previsto na Cláusula 4ª sem que haja manifestação de cancelamento, o presente contrato passará a vigorar com </w:t>
+      </w:r>
+      <w:r>
+        <w:rPr>
+          <w:b/>
+          <w:bCs/>
+        </w:rPr>
+        <w:t>prazo de fidelidade mínima de 12 (doze) meses</w:t>
+      </w:r>
+      <w:r>
+        <w:t>, contados a partir da assinatura.</w:t>
+      </w:r>
+      <w:r>
+        <w:br/>
+        <w:t>5.2. Caso o CONTRATANTE solicite a rescisão imotivada do contrato após o 15º dia e antes do término do prazo de fidelidade de 12 meses, ficará obrigado a:</w:t>
+      </w:r>
+    </w:p>
+    <w:p>
+      <w:pPr>
+        <w:numPr>
+          <w:ilvl w:val="0"/>
+          <w:numId w:val="1"/>
+        </w:numPr>
+      </w:pPr>
+      <w:r>
+        <w:rPr>
+          <w:b/>
+          <w:bCs/>
+        </w:rPr>
+        <w:t>a)</w:t>
+      </w:r>
+      <w:r>
+        <w:t xml:space="preserve"> Quitar imediatamente o saldo remanescente integral da taxa de implantação de R$ 3.000,00, caso ainda existam parcelas a vencer;</w:t>
+      </w:r>
+    </w:p>
+    <w:p>
+      <w:pPr>
+        <w:numPr>
+          <w:ilvl w:val="0"/>
+          <w:numId w:val="1"/>
+        </w:numPr>
+      </w:pPr>
+      <w:r>
+        <w:rPr>
+          <w:b/>
+          <w:bCs/>
+        </w:rPr>
+        <w:t>b)</w:t>
+      </w:r>
+      <w:r>
+        <w:t xml:space="preserve"> Pagar uma multa compensatória equivalente a </w:t>
+      </w:r>
+      <w:r>
+        <w:rPr>
+          <w:b/>
+          <w:bCs/>
+        </w:rPr>
+        <w:t>30% (trinta por cento) sobre a soma das mensalidades restantes</w:t>
+      </w:r>
+      <w:r>
+        <w:t xml:space="preserve"> para o término do período de fidelidade.</w:t>
+      </w:r>
+      <w:r>
+        <w:br/>
+        <w:t>5.3. Após o período inicial de 12 meses, o contrato será renovado automaticamente por prazo indeterminado, podendo ser rescindido por qualquer uma das partes mediante aviso prévio por escrito com antecedência mínima de 30 (trinta) dias, sem aplicação de multa.</w:t>
+      </w:r>
+    </w:p>
+    <w:p>
+      <w:pPr>
+        <w:rPr>
+          <w:b/>
+          <w:bCs/>
+        </w:rPr>
+      </w:pPr>
+      <w:r>
+        <w:rPr>
+          <w:b/>
+          <w:bCs/>
+        </w:rPr>
+        <w:t>6. SUPORTE E MANUTENÇÃO</w:t>
+      </w:r>
+    </w:p>
+    <w:p>
+      <w:r>
+        <w:lastRenderedPageBreak/>
+        <w:t>6.1. O CONTRATADO disponibilizará suporte técnico ao CONTRATANTE em regime de 24 horas por dia, 7 dias por semana, exclusivamente para chamados de urgência (parada total do sistema), através dos canais de atendimento definidos.</w:t>
+      </w:r>
+      <w:r>
+        <w:br/>
+        <w:t>6.2. Dúvidas operacionais e configurações rotineiras serão atendidas em horário comercial.</w:t>
+      </w:r>
+      <w:r>
+        <w:br/>
+        <w:t>6.3. O suporte compreende exclusivamente falhas internas do software Vision+. Estão excluídos do suporte problemas de conectividade com a internet do condomínio, quedas de energia elétrica local, falhas nos computadores/tablets da portaria ou mau uso do sistema pelos operadores.</w:t>
+      </w:r>
+    </w:p>
+    <w:p>
+      <w:pPr>
+        <w:rPr>
+          <w:b/>
+          <w:bCs/>
+        </w:rPr>
+      </w:pPr>
+      <w:r>
+        <w:rPr>
+          <w:b/>
+          <w:bCs/>
+        </w:rPr>
+        <w:t>7. INADIMPLÊNCIA</w:t>
+      </w:r>
+    </w:p>
+    <w:p>
+      <w:r>
+        <w:t>7.1. O atraso no pagamento de qualquer obrigação (mensalidade ou parcela de implantação) sujeitará o CONTRATANTE à multa de 2% (dois por cento) sobre o valor devido, mais juros de mora de 1% (um por cento) ao mês.</w:t>
+      </w:r>
+      <w:r>
+        <w:br/>
+        <w:t>7.2. Se o atraso for superior a 10 (dez) dias corridos, o CONTRATADO poderá suspender temporariamente o acesso do condomínio ao sistema até a total regularização dos débitos.</w:t>
+      </w:r>
+      <w:r>
+        <w:br/>
+        <w:t>7.3. A suspensão do acesso por inadimplência não quita os valores devidos e não interrompe a contagem do prazo de fidelidade do contrato.</w:t>
+      </w:r>
+    </w:p>
+    <w:p>
+      <w:pPr>
+        <w:rPr>
+          <w:b/>
+          <w:bCs/>
+        </w:rPr>
+      </w:pPr>
+      <w:r>
+        <w:rPr>
+          <w:b/>
+          <w:bCs/>
+        </w:rPr>
+        <w:t>8. PROTEÇÃO DE DADOS (LGPD)</w:t>
+      </w:r>
+    </w:p>
+    <w:p>
+      <w:r>
+        <w:t>8.1. O CONTRATANTE atua como Controlador dos dados pessoais inseridos no sistema, sendo o único responsável pela coleta legal, legitimidade e autorização dos dados de moradores, visitantes e prestadores de serviço, nos termos da Lei nº 13.709/2018 (LGPD).</w:t>
+      </w:r>
+      <w:r>
+        <w:br/>
+        <w:t>8.2. O CONTRATADO atua como Operador de dados, limitando-se a processar, hospedar e armazenar as informações em servidores seguros na nuvem, aplicando medidas de segurança digitais razoáveis para a proteção da base de dados.</w:t>
+      </w:r>
+      <w:r>
+        <w:br/>
+        <w:t>8.3. O CONTRATADO não utilizará, venderá ou compartilhará os dados do condomínio com terceiros sob nenhuma hipótese. Em caso de encerramento do contrato, os dados serão exportados e disponibilizados ao CONTRATANTE, sendo excluídos definitivamente dos servidores do software após 30 dias.</w:t>
+      </w:r>
+    </w:p>
+    <w:p>
+      <w:pPr>
+        <w:rPr>
+          <w:b/>
+          <w:bCs/>
+        </w:rPr>
+      </w:pPr>
+      <w:r>
+        <w:rPr>
+          <w:b/>
+          <w:bCs/>
+        </w:rPr>
+        <w:t>9. RESPONSABILIDADES GERAIS E PROPRIEDADE</w:t>
+      </w:r>
+    </w:p>
+    <w:p>
+      <w:r>
+        <w:t>9.1. O CONTRATANTE obriga-se a manter o sigilo de suas senhas de acesso administrativo, respondendo por qualquer uso indevido da plataforma por seus funcionários ou prepostos.</w:t>
+      </w:r>
+      <w:r>
+        <w:br/>
+        <w:t xml:space="preserve">9.2. O CONTRATADO envidará os melhores esforços para manter o sistema disponível na maior parte do tempo, contudo, o CONTRATANTE declara estar ciente de que softwares baseados em nuvem podem sofrer instabilidades </w:t>
+      </w:r>
+      <w:r>
+        <w:lastRenderedPageBreak/>
+        <w:t>temporárias decorrentes de manutenção ou falhas em serviços de infraestrutura global (como servidores de hospedagem).</w:t>
+      </w:r>
+      <w:r>
+        <w:br/>
+        <w:t>9.3. É terminantemente proibido ao CONTRATANTE realizar engenharia reversa, sublicenciar, doar, copiar ou tentar extrair o código-fonte do Vision+, sob pena de rescisão imediata por infração penal e cível de propriedade intelectual.</w:t>
+      </w:r>
+    </w:p>
+    <w:p>
+      <w:pPr>
+        <w:rPr>
+          <w:b/>
+          <w:bCs/>
+        </w:rPr>
+      </w:pPr>
+      <w:r>
+        <w:rPr>
+          <w:b/>
+          <w:bCs/>
+        </w:rPr>
+        <w:t>10. FORO</w:t>
+      </w:r>
+    </w:p>
+    <w:p>
+      <w:r>
+        <w:t xml:space="preserve">10.1. Para dirimir quaisquer dúvidas ou controvérsias oriundas do presente contrato, as partes elegem a Comarca de </w:t>
+      </w:r>
+      <w:r>
+        <w:rPr>
+          <w:b/>
+          <w:bCs/>
+        </w:rPr>
+        <w:t>São Bernardo do Campo - SP</w:t>
+      </w:r>
+      <w:r>
+        <w:t>, com renúncia expressa a qualquer outro foro, por mais privilegiado que seja.</w:t>
+      </w:r>
+    </w:p>
+    <w:p>
+      <w:r>
+        <w:t>E, por estarem justas e contratadas, as partes assinam o presente instrumento em duas vias de igual teor.</w:t>
+      </w:r>
+    </w:p>
+    <w:p>
+      <w:r>
+        <w:t xml:space="preserve">________________________________, ____ de __________________ </w:t>
+      </w:r>
+      <w:proofErr w:type="spellStart"/>
+      <w:r>
+        <w:t>de</w:t>
+      </w:r>
+      <w:proofErr w:type="spellEnd"/>
+      <w:r>
+        <w:t xml:space="preserve"> 2026.</w:t>
+      </w:r>
+    </w:p>
+    <w:p>
+      <w:r>
+        <w:rPr>
+          <w:b/>
+          <w:bCs/>
+        </w:rPr>
+        <w:t>CONTRATANTE</w:t>
+      </w:r>
+      <w:r>
+        <w:br/>
+        <w:t>Condomínio: _______________________________________________</w:t>
+      </w:r>
+      <w:r>
+        <w:br/>
+        <w:t>Representante: ____________________________________________</w:t>
+      </w:r>
+      <w:r>
+        <w:br/>
+        <w:t>CPF: ______________________________________________________</w:t>
+      </w:r>
+      <w:r>
+        <w:br/>
+        <w:t>Assinatura: _______________________________________________</w:t>
+      </w:r>
+    </w:p>
+    <w:p>
+      <w:r>
+        <w:rPr>
+          <w:b/>
+          <w:bCs/>
+        </w:rPr>
+        <w:t>CONTRATADO</w:t>
+      </w:r>
+      <w:r>
+        <w:br/>
         <w:t>Marlon dos Santos Lima</w:t>
       </w:r>
       <w:r>
-        <w:t xml:space="preserve">, CPF nº </w:t>
-      </w:r>
-      <w:r>
-        <w:rPr>
-          <w:b/>
-          <w:bCs/>
-        </w:rPr>
-        <w:t>406.393.288-9</w:t>
-      </w:r>
-      <w:r>
-        <w:t xml:space="preserve">, doravante denominado simplesmente </w:t>
-      </w:r>
-      <w:r>
-        <w:rPr>
-          <w:b/>
-          <w:bCs/>
-        </w:rPr>
-        <w:t>CONTRATADO</w:t>
-      </w:r>
-      <w:r>
-        <w:t>.</w:t>
-      </w:r>
-    </w:p>
-    <w:p>
-      <w:r>
-        <w:t>As partes acima identificadas celebram o presente Contrato de Licença de Uso de Software e Prestação de Serviços, mediante as cláusulas seguintes.</w:t>
-      </w:r>
-    </w:p>
-    <w:p>
-      <w:pPr>
-        <w:rPr>
-          <w:b/>
-          <w:bCs/>
-        </w:rPr>
-      </w:pPr>
-      <w:r>
-        <w:rPr>
-          <w:b/>
-          <w:bCs/>
-        </w:rPr>
-        <w:t>1. OBJETO</w:t>
-      </w:r>
-    </w:p>
-    <w:p>
-      <w:r>
-        <w:t xml:space="preserve">1.1. O presente contrato tem como objeto a disponibilização, pelo CONTRATADO, do sistema denominado </w:t>
-      </w:r>
-      <w:r>
-        <w:rPr>
-          <w:b/>
-          <w:bCs/>
-        </w:rPr>
-        <w:t>Vision+</w:t>
-      </w:r>
-      <w:r>
-        <w:t>, destinado ao gerenciamento e apoio às atividades de portaria e controle de informações do condomínio.</w:t>
-      </w:r>
-    </w:p>
-    <w:p>
-      <w:r>
-        <w:t>1.2. O sistema poderá contemplar funcionalidades como cadastro e gerenciamento de moradores, visitantes, veículos, encomendas, registros de portaria e demais funcionalidades disponibilizadas pelo CONTRATADO.</w:t>
-      </w:r>
-    </w:p>
-    <w:p>
-      <w:r>
-        <w:t>1.3. O CONTRATADO concede ao CONTRATANTE uma licença de uso do sistema durante a vigência deste contrato.</w:t>
-      </w:r>
-    </w:p>
-    <w:p>
-      <w:r>
-        <w:t>1.4. A licença é limitada ao uso pelo CONTRATANTE e não implica transferência da propriedade intelectual, código-fonte ou direitos sobre o software.</w:t>
-      </w:r>
-    </w:p>
-    <w:p>
-      <w:pPr>
-        <w:rPr>
-          <w:b/>
-          <w:bCs/>
-        </w:rPr>
-      </w:pPr>
-      <w:r>
-        <w:rPr>
-          <w:b/>
-          <w:bCs/>
-        </w:rPr>
-        <w:t>2. IMPLANTAÇÃO</w:t>
-      </w:r>
-    </w:p>
-    <w:p>
-      <w:r>
-        <w:t xml:space="preserve">2.1. Pela implantação e configuração inicial do sistema, o CONTRATANTE pagará ao CONTRATADO o valor de </w:t>
-      </w:r>
-      <w:r>
-        <w:rPr>
-          <w:b/>
-          <w:bCs/>
-        </w:rPr>
-        <w:t>R$ 3.000,00 (três mil reais)</w:t>
-      </w:r>
-      <w:r>
-        <w:t>.</w:t>
-      </w:r>
-    </w:p>
-    <w:p>
-      <w:r>
-        <w:t>2.2. A implantação poderá compreender configuração inicial, cadastro/configuração do condomínio, criação de acessos, preparação do ambiente e orientação inicial para utilização do sistema.</w:t>
-      </w:r>
-    </w:p>
-    <w:p>
-      <w:r>
-        <w:t>2.3. Serviços adicionais não previstos na implantação poderão ser negociados separadamente entre as partes.</w:t>
-      </w:r>
-    </w:p>
-    <w:p>
-      <w:pPr>
-        <w:rPr>
-          <w:b/>
-          <w:bCs/>
-        </w:rPr>
-      </w:pPr>
-      <w:r>
-        <w:rPr>
-          <w:b/>
-          <w:bCs/>
-        </w:rPr>
-        <w:t>3. MENSALIDADE</w:t>
-      </w:r>
-    </w:p>
-    <w:p>
-      <w:r>
-        <w:t xml:space="preserve">3.1. Pela licença de uso do sistema e pelos serviços de suporte e manutenção, o CONTRATANTE pagará ao CONTRATADO o valor de </w:t>
-      </w:r>
-      <w:r>
-        <w:rPr>
-          <w:b/>
-          <w:bCs/>
-        </w:rPr>
-        <w:t>R$ 300,00 (trezentos reais) por mês</w:t>
-      </w:r>
-      <w:r>
-        <w:t>.</w:t>
-      </w:r>
-    </w:p>
-    <w:p>
-      <w:r>
-        <w:t>3.2. O pagamento será realizado mensalmente, na data acordada entre as partes.</w:t>
-      </w:r>
-    </w:p>
-    <w:p>
-      <w:r>
-        <w:lastRenderedPageBreak/>
-        <w:t xml:space="preserve">3.3. O contrato será celebrado </w:t>
-      </w:r>
-      <w:r>
-        <w:rPr>
-          <w:b/>
-          <w:bCs/>
-        </w:rPr>
-        <w:t>sem período mínimo de fidelidade</w:t>
-      </w:r>
-      <w:r>
-        <w:t>, podendo ser encerrado conforme as condições estabelecidas neste instrumento.</w:t>
-      </w:r>
-    </w:p>
-    <w:p>
-      <w:pPr>
-        <w:rPr>
-          <w:b/>
-          <w:bCs/>
-        </w:rPr>
-      </w:pPr>
-      <w:r>
-        <w:rPr>
-          <w:b/>
-          <w:bCs/>
-        </w:rPr>
-        <w:t>4. SUPORTE E MANUTENÇÃO</w:t>
-      </w:r>
-    </w:p>
-    <w:p>
-      <w:r>
-        <w:t>4.1. O CONTRATADO disponibilizará suporte técnico ao CONTRATANTE durante a vigência do contrato.</w:t>
-      </w:r>
-    </w:p>
-    <w:p>
-      <w:r>
-        <w:t xml:space="preserve">4.2. O suporte será disponibilizado </w:t>
-      </w:r>
-      <w:r>
-        <w:rPr>
-          <w:b/>
-          <w:bCs/>
-        </w:rPr>
-        <w:t>24 horas</w:t>
-      </w:r>
-      <w:r>
-        <w:t>, por meio dos canais de atendimento definidos entre as partes.</w:t>
-      </w:r>
-    </w:p>
-    <w:p>
-      <w:r>
-        <w:t>4.3. O suporte compreende auxílio relacionado ao funcionamento do sistema, correção de erros e orientações para utilização das funcionalidades disponibilizadas.</w:t>
-      </w:r>
-    </w:p>
-    <w:p>
-      <w:r>
-        <w:t>4.4. O suporte não compreende problemas causados por equipamentos, internet, energia elétrica, sistemas de terceiros ou outros fatores externos ao controle do CONTRATADO.</w:t>
-      </w:r>
-    </w:p>
-    <w:p>
-      <w:pPr>
-        <w:rPr>
-          <w:b/>
-          <w:bCs/>
-        </w:rPr>
-      </w:pPr>
-      <w:r>
-        <w:rPr>
-          <w:b/>
-          <w:bCs/>
-        </w:rPr>
-        <w:t>5. INADIMPLÊNCIA</w:t>
-      </w:r>
-    </w:p>
-    <w:p>
-      <w:r>
-        <w:t xml:space="preserve">5.1. Em caso de atraso no pagamento da mensalidade, o CONTRATANTE terá prazo de até </w:t>
-      </w:r>
-      <w:r>
-        <w:rPr>
-          <w:b/>
-          <w:bCs/>
-        </w:rPr>
-        <w:t>10 (dez) dias</w:t>
-      </w:r>
-      <w:r>
-        <w:t xml:space="preserve"> para regularização.</w:t>
-      </w:r>
-    </w:p>
-    <w:p>
-      <w:r>
-        <w:t>5.2. Persistindo o atraso após o prazo estabelecido, o CONTRATADO poderá suspender o acesso ao sistema até que os valores pendentes sejam regularizados.</w:t>
-      </w:r>
-    </w:p>
-    <w:p>
-      <w:r>
-        <w:t>5.3. A suspensão do acesso não implica automaticamente a exclusão dos dados do CONTRATANTE.</w:t>
-      </w:r>
-    </w:p>
-    <w:p>
-      <w:r>
-        <w:t>5.4. Após a regularização dos valores pendentes, o CONTRATADO poderá restabelecer o acesso ao sistema.</w:t>
-      </w:r>
-    </w:p>
-    <w:p>
-      <w:pPr>
-        <w:rPr>
-          <w:b/>
-          <w:bCs/>
-        </w:rPr>
-      </w:pPr>
-      <w:r>
-        <w:rPr>
-          <w:b/>
-          <w:bCs/>
-        </w:rPr>
-        <w:t>6. CANCELAMENTO</w:t>
-      </w:r>
-    </w:p>
-    <w:p>
-      <w:r>
-        <w:t>6.1. Por se tratar de contratação sem fidelidade, qualquer uma das partes poderá solicitar o encerramento do contrato.</w:t>
-      </w:r>
-    </w:p>
-    <w:p>
-      <w:r>
-        <w:t>6.2. O cancelamento não terá multa de fidelidade.</w:t>
-      </w:r>
-    </w:p>
-    <w:p>
-      <w:r>
-        <w:t>6.3. Valores referentes a serviços já prestados ou períodos já iniciados deverão ser quitados conforme as condições deste contrato.</w:t>
-      </w:r>
-    </w:p>
-    <w:p>
-      <w:r>
-        <w:t>6.4. As partes poderão estabelecer, por escrito, a data efetiva de encerramento do serviço.</w:t>
-      </w:r>
-    </w:p>
-    <w:p>
-      <w:pPr>
-        <w:rPr>
-          <w:b/>
-          <w:bCs/>
-        </w:rPr>
-      </w:pPr>
-      <w:r>
-        <w:rPr>
-          <w:b/>
-          <w:bCs/>
-        </w:rPr>
-        <w:t>7. DADOS E LGPD</w:t>
-      </w:r>
-    </w:p>
-    <w:p>
-      <w:r>
-        <w:lastRenderedPageBreak/>
-        <w:t>7.1. O sistema poderá armazenar dados pessoais fornecidos ou inseridos pelo CONTRATANTE, incluindo, conforme a utilização do sistema, informações de moradores, visitantes, funcionários e veículos.</w:t>
-      </w:r>
-    </w:p>
-    <w:p>
-      <w:r>
-        <w:t>7.2. O CONTRATANTE será responsável pela legitimidade e finalidade dos dados inseridos no sistema e deverá utilizar o sistema de acordo com a legislação aplicável.</w:t>
-      </w:r>
-    </w:p>
-    <w:p>
-      <w:r>
-        <w:t>7.3. O CONTRATADO deverá adotar medidas razoáveis de segurança para proteger os dados armazenados contra acesso não autorizado, perda, alteração ou divulgação indevida.</w:t>
-      </w:r>
-    </w:p>
-    <w:p>
-      <w:r>
-        <w:t>7.4. O acesso às informações deverá ser limitado aos usuários autorizados pelo CONTRATANTE, conforme os recursos de controle de acesso disponíveis no sistema.</w:t>
-      </w:r>
-    </w:p>
-    <w:p>
-      <w:r>
-        <w:t xml:space="preserve">7.5. As partes comprometem-se a observar a legislação aplicável sobre proteção de dados pessoais, especialmente a </w:t>
-      </w:r>
-      <w:r>
-        <w:rPr>
-          <w:b/>
-          <w:bCs/>
-        </w:rPr>
-        <w:t>Lei Geral de Proteção de Dados Pessoais — Lei nº 13.709/2018 (LGPD)</w:t>
-      </w:r>
-      <w:r>
-        <w:t>.</w:t>
-      </w:r>
-    </w:p>
-    <w:p>
-      <w:r>
-        <w:t>7.6. Em caso de incidente relevante de segurança envolvendo dados pessoais, as partes deverão comunicar-se e adotar as medidas cabíveis de acordo com a legislação aplicável.</w:t>
-      </w:r>
-    </w:p>
-    <w:p>
-      <w:pPr>
-        <w:rPr>
-          <w:b/>
-          <w:bCs/>
-        </w:rPr>
-      </w:pPr>
-      <w:r>
-        <w:rPr>
-          <w:b/>
-          <w:bCs/>
-        </w:rPr>
-        <w:t>8. RESPONSABILIDADES DO CONTRATANTE</w:t>
-      </w:r>
-    </w:p>
-    <w:p>
-      <w:r>
-        <w:t>8.1. O CONTRATANTE será responsável pelos dados e informações inseridos no sistema por seus usuários.</w:t>
-      </w:r>
-    </w:p>
-    <w:p>
-      <w:r>
-        <w:t>8.2. O CONTRATANTE deverá manter sob sua responsabilidade os dados de acesso de seus usuários, evitando o compartilhamento indevido de senhas.</w:t>
-      </w:r>
-    </w:p>
-    <w:p>
-      <w:r>
-        <w:t>8.3. O CONTRATANTE deverá comunicar ao CONTRATADO qualquer suspeita de acesso não autorizado ou falha de segurança.</w:t>
-      </w:r>
-    </w:p>
-    <w:p>
-      <w:pPr>
-        <w:rPr>
-          <w:b/>
-          <w:bCs/>
-        </w:rPr>
-      </w:pPr>
-      <w:r>
-        <w:rPr>
-          <w:b/>
-          <w:bCs/>
-        </w:rPr>
-        <w:t>9. RESPONSABILIDADES DO CONTRATADO</w:t>
-      </w:r>
-    </w:p>
-    <w:p>
-      <w:r>
-        <w:t>9.1. O CONTRATADO deverá disponibilizar o sistema conforme as funcionalidades contratadas.</w:t>
-      </w:r>
-    </w:p>
-    <w:p>
-      <w:r>
-        <w:t>9.2. O CONTRATADO deverá prestar o suporte previsto neste contrato.</w:t>
-      </w:r>
-    </w:p>
-    <w:p>
-      <w:r>
-        <w:t>9.3. O CONTRATADO deverá buscar corrigir falhas técnicas identificadas no sistema dentro de prazo razoável, considerando a natureza e complexidade do problema.</w:t>
-      </w:r>
-    </w:p>
-    <w:p>
-      <w:r>
-        <w:lastRenderedPageBreak/>
-        <w:t>9.4. O CONTRATADO não será responsável por indisponibilidades decorrentes exclusivamente de falhas de internet, energia elétrica, equipamentos do CONTRATANTE, serviços de terceiros ou eventos fora de seu controle.</w:t>
-      </w:r>
-    </w:p>
-    <w:p>
-      <w:pPr>
-        <w:rPr>
-          <w:b/>
-          <w:bCs/>
-        </w:rPr>
-      </w:pPr>
-      <w:r>
-        <w:rPr>
-          <w:b/>
-          <w:bCs/>
-        </w:rPr>
-        <w:t>10. PROPRIEDADE INTELECTUAL</w:t>
-      </w:r>
-    </w:p>
-    <w:p>
-      <w:r>
-        <w:t xml:space="preserve">10.1. O software </w:t>
-      </w:r>
-      <w:r>
-        <w:rPr>
-          <w:b/>
-          <w:bCs/>
-        </w:rPr>
-        <w:t>Vision+</w:t>
-      </w:r>
-      <w:r>
-        <w:t>, seu código-fonte, estrutura, interface, funcionalidades, marca e demais elementos desenvolvidos pelo CONTRATADO permanecem de propriedade de seus respectivos titulares.</w:t>
-      </w:r>
-    </w:p>
-    <w:p>
-      <w:r>
-        <w:t>10.2. Este contrato concede apenas o direito de utilização do sistema durante sua vigência.</w:t>
-      </w:r>
-    </w:p>
-    <w:p>
-      <w:r>
-        <w:t>10.3. O CONTRATANTE não poderá copiar, modificar, comercializar, sublicenciar, distribuir ou tentar obter o código-fonte do sistema sem autorização expressa do CONTRATADO.</w:t>
-      </w:r>
-    </w:p>
-    <w:p>
-      <w:pPr>
-        <w:rPr>
-          <w:b/>
-          <w:bCs/>
-        </w:rPr>
-      </w:pPr>
-      <w:r>
-        <w:rPr>
-          <w:b/>
-          <w:bCs/>
-        </w:rPr>
-        <w:t>11. BACKUP E DISPONIBILIDADE</w:t>
-      </w:r>
-    </w:p>
-    <w:p>
-      <w:r>
-        <w:t>11.1. O CONTRATADO buscará manter mecanismos de proteção e backup dos dados conforme a infraestrutura utilizada pelo sistema.</w:t>
-      </w:r>
-    </w:p>
-    <w:p>
-      <w:r>
-        <w:t>11.2. Os procedimentos de backup poderão variar de acordo com o serviço de hospedagem e infraestrutura tecnológica utilizada.</w:t>
-      </w:r>
-    </w:p>
-    <w:p>
-      <w:r>
-        <w:t>11.3. O CONTRATADO não garante disponibilidade absoluta e ininterrupta do sistema, especialmente diante de falhas de terceiros, internet, energia, servidores ou eventos de força maior.</w:t>
-      </w:r>
-    </w:p>
-    <w:p>
-      <w:pPr>
-        <w:rPr>
-          <w:b/>
-          <w:bCs/>
-        </w:rPr>
-      </w:pPr>
-      <w:r>
-        <w:rPr>
-          <w:b/>
-          <w:bCs/>
-        </w:rPr>
-        <w:t>12. ALTERAÇÕES E ATUALIZAÇÕES</w:t>
-      </w:r>
-    </w:p>
-    <w:p>
-      <w:r>
-        <w:t>12.1. O CONTRATADO poderá realizar atualizações, correções e melhorias no sistema visando segurança, desempenho e evolução das funcionalidades.</w:t>
-      </w:r>
-    </w:p>
-    <w:p>
-      <w:r>
-        <w:t>12.2. Alterações que impliquem contratação de novos serviços ou funcionalidades específicas poderão ser negociadas separadamente.</w:t>
-      </w:r>
-    </w:p>
-    <w:p>
-      <w:pPr>
-        <w:rPr>
-          <w:b/>
-          <w:bCs/>
-        </w:rPr>
-      </w:pPr>
-      <w:r>
-        <w:rPr>
-          <w:b/>
-          <w:bCs/>
-        </w:rPr>
-        <w:t>13. VIGÊNCIA</w:t>
-      </w:r>
-    </w:p>
-    <w:p>
-      <w:r>
-        <w:t>13.1. O presente contrato terá vigência por prazo indeterminado, iniciando-se na data de sua assinatura.</w:t>
-      </w:r>
-    </w:p>
-    <w:p>
-      <w:r>
-        <w:t>13.2. A contratação permanecerá ativa enquanto houver interesse das partes e pagamento da mensalidade, observadas as regras de cancelamento previstas neste contrato.</w:t>
-      </w:r>
-    </w:p>
-    <w:p>
-      <w:pPr>
-        <w:rPr>
-          <w:b/>
-          <w:bCs/>
-        </w:rPr>
-      </w:pPr>
-      <w:r>
-        <w:rPr>
-          <w:b/>
-          <w:bCs/>
-        </w:rPr>
-        <w:t>14. DISPOSIÇÕES GERAIS</w:t>
-      </w:r>
-    </w:p>
-    <w:p>
-      <w:r>
-        <w:lastRenderedPageBreak/>
-        <w:t>14.1. Este contrato representa as condições acordadas entre as partes em relação à utilização do sistema Vision+.</w:t>
-      </w:r>
-    </w:p>
-    <w:p>
-      <w:r>
-        <w:t>14.2. Eventuais alterações neste contrato deverão ser realizadas por escrito e aceitas pelas partes.</w:t>
-      </w:r>
-    </w:p>
-    <w:p>
-      <w:r>
-        <w:t>14.3. A eventual tolerância de uma das partes quanto ao descumprimento de alguma obrigação não constituirá renúncia de direito.</w:t>
-      </w:r>
-    </w:p>
-    <w:p>
-      <w:pPr>
-        <w:rPr>
-          <w:b/>
-          <w:bCs/>
-        </w:rPr>
-      </w:pPr>
-      <w:r>
-        <w:rPr>
-          <w:b/>
-          <w:bCs/>
-        </w:rPr>
-        <w:t>15. FORO</w:t>
-      </w:r>
-    </w:p>
-    <w:p>
-      <w:r>
-        <w:t>15.1. As partes poderão eleger o foro competente para resolver eventuais questões decorrentes deste contrato, observadas as regras legais aplicáveis.</w:t>
-      </w:r>
-    </w:p>
-    <w:p>
-      <w:r>
-        <w:t>E, por estarem de acordo, as partes assinam o presente instrumento.</w:t>
-      </w:r>
-    </w:p>
-    <w:p>
-      <w:r>
-        <w:rPr>
-          <w:b/>
-          <w:bCs/>
-        </w:rPr>
-        <w:t xml:space="preserve">__________________________________, ____ de __________________ </w:t>
-      </w:r>
-      <w:proofErr w:type="spellStart"/>
-      <w:r>
-        <w:rPr>
-          <w:b/>
-          <w:bCs/>
-        </w:rPr>
-        <w:t>de</w:t>
-      </w:r>
-      <w:proofErr w:type="spellEnd"/>
-      <w:r>
-        <w:rPr>
-          <w:b/>
-          <w:bCs/>
-        </w:rPr>
-        <w:t xml:space="preserve"> 2026.</w:t>
-      </w:r>
-    </w:p>
-    <w:p>
-      <w:pPr>
-        <w:rPr>
-          <w:b/>
-          <w:bCs/>
-        </w:rPr>
-      </w:pPr>
-      <w:r>
-        <w:rPr>
-          <w:b/>
-          <w:bCs/>
-        </w:rPr>
-        <w:t>CONTRATANTE</w:t>
-      </w:r>
-    </w:p>
-    <w:p>
-      <w:r>
-        <w:rPr>
-          <w:b/>
-          <w:bCs/>
-        </w:rPr>
-        <w:t>Condomínio:</w:t>
-      </w:r>
-      <w:r>
-        <w:t xml:space="preserve"> ________________________________________________</w:t>
-      </w:r>
-    </w:p>
-    <w:p>
-      <w:r>
-        <w:rPr>
-          <w:b/>
-          <w:bCs/>
-        </w:rPr>
-        <w:t>Representante:</w:t>
-      </w:r>
-      <w:r>
-        <w:t xml:space="preserve"> _____________________________________________</w:t>
-      </w:r>
-    </w:p>
-    <w:p>
-      <w:r>
-        <w:rPr>
-          <w:b/>
-          <w:bCs/>
-        </w:rPr>
-        <w:t>CPF:</w:t>
-      </w:r>
-      <w:r>
-        <w:t xml:space="preserve"> ______________________________________________________</w:t>
-      </w:r>
-    </w:p>
-    <w:p>
-      <w:r>
-        <w:rPr>
-          <w:b/>
-          <w:bCs/>
-        </w:rPr>
-        <w:t>Assinatura:</w:t>
-      </w:r>
-      <w:r>
-        <w:t xml:space="preserve"> _________________________________________________</w:t>
-      </w:r>
-    </w:p>
-    <w:p>
-      <w:pPr>
-        <w:rPr>
-          <w:b/>
-          <w:bCs/>
-        </w:rPr>
-      </w:pPr>
-      <w:r>
-        <w:rPr>
-          <w:b/>
-          <w:bCs/>
-        </w:rPr>
-        <w:t>CONTRATADO</w:t>
-      </w:r>
-    </w:p>
-    <w:p>
-      <w:r>
-        <w:rPr>
-          <w:b/>
-          <w:bCs/>
-        </w:rPr>
-        <w:t>Marlon dos Santos Lima</w:t>
-      </w:r>
-    </w:p>
-    <w:p>
-      <w:r>
-        <w:rPr>
-          <w:b/>
-          <w:bCs/>
-        </w:rPr>
-        <w:t>CPF:</w:t>
-      </w:r>
-      <w:r>
-        <w:t xml:space="preserve"> 406.393.288-9</w:t>
-      </w:r>
-    </w:p>
-    <w:p>
-      <w:r>
-        <w:rPr>
-          <w:b/>
-          <w:bCs/>
-        </w:rPr>
-        <w:t>Assinatura:</w:t>
-      </w:r>
-      <w:r>
-        <w:t xml:space="preserve"> _________________________________________________</w:t>
-      </w:r>
-    </w:p>
-    <w:p>
-      <w:pPr>
-        <w:rPr>
-          <w:b/>
-          <w:bCs/>
-        </w:rPr>
-      </w:pPr>
+        <w:br/>
+        <w:t>CPF: 406.393.288-9</w:t>
+      </w:r>
+      <w:r>
+        <w:br/>
+        <w:t>Assinatura: _______________________________________________</w:t>
+      </w:r>
+    </w:p>
+    <w:p>
       <w:r>
         <w:rPr>
           <w:b/>
@@ -785,92 +556,20 @@
         </w:rPr>
         <w:t>TESTEMUNHA 1</w:t>
       </w:r>
-    </w:p>
-    <w:p>
-      <w:r>
-        <w:rPr>
-          <w:b/>
-          <w:bCs/>
-        </w:rPr>
-        <w:t>Nome:</w:t>
-      </w:r>
-      <w:r>
-        <w:t xml:space="preserve"> _____________________________________________________</w:t>
-      </w:r>
-    </w:p>
-    <w:p>
-      <w:r>
-        <w:rPr>
-          <w:b/>
-          <w:bCs/>
-        </w:rPr>
-        <w:t>CPF:</w:t>
-      </w:r>
-      <w:r>
-        <w:t xml:space="preserve"> ______________________________________________________</w:t>
-      </w:r>
-    </w:p>
-    <w:p>
-      <w:r>
-        <w:rPr>
-          <w:b/>
-          <w:bCs/>
-        </w:rPr>
-        <w:t>Assinatura:</w:t>
-      </w:r>
-      <w:r>
-        <w:t xml:space="preserve"> _________________________________________________</w:t>
-      </w:r>
-    </w:p>
-    <w:p>
-      <w:pPr>
-        <w:rPr>
-          <w:b/>
-          <w:bCs/>
-        </w:rPr>
-      </w:pPr>
-      <w:r>
-        <w:rPr>
-          <w:b/>
-          <w:bCs/>
-        </w:rPr>
-        <w:t>TESTEMUNHA 2</w:t>
-      </w:r>
-    </w:p>
-    <w:p>
-      <w:r>
-        <w:rPr>
-          <w:b/>
-          <w:bCs/>
-        </w:rPr>
-        <w:t>Nome:</w:t>
-      </w:r>
-      <w:r>
-        <w:t xml:space="preserve"> _____________________________________________________</w:t>
-      </w:r>
-    </w:p>
-    <w:p>
-      <w:r>
-        <w:rPr>
-          <w:b/>
-          <w:bCs/>
-        </w:rPr>
-        <w:t>CPF:</w:t>
-      </w:r>
-      <w:r>
-        <w:t xml:space="preserve"> ______________________________________________________</w:t>
-      </w:r>
-    </w:p>
-    <w:p>
-      <w:r>
-        <w:rPr>
-          <w:b/>
-          <w:bCs/>
-        </w:rPr>
-        <w:t>Assinatura:</w:t>
-      </w:r>
-      <w:r>
-        <w:t xml:space="preserve"> _________________________________________________</w:t>
+      <w:r>
+        <w:br/>
+        <w:t>Nome: _____________________________</w:t>
+      </w:r>
+      <w:r>
+        <w:br/>
+        <w:t>CPF: ______________________________</w:t>
+      </w:r>
+    </w:p>
+    <w:p>
+      <w:r>
+        <w:pict w14:anchorId="0B5BBCFF">
+          <v:rect id="_x0000_i1031" style="width:0;height:1.5pt" o:hralign="center" o:hrstd="t" o:hr="t" fillcolor="#a0a0a0" stroked="f"/>
+        </w:pict>
       </w:r>
     </w:p>
     <w:p/>
@@ -882,6 +581,163 @@
     </w:sectPr>
   </w:body>
 </w:document>
+</file>
+
+<file path=word/numbering.xml><?xml version="1.0" encoding="utf-8"?>
+<w:numbering xmlns:wpc="http://schemas.microsoft.com/office/word/2010/wordprocessingCanvas" xmlns:cx="http://schemas.microsoft.com/office/drawing/2014/chartex" xmlns:cx1="http://schemas.microsoft.com/office/drawing/2015/9/8/chartex" xmlns:cx2="http://schemas.microsoft.com/office/drawing/2015/10/21/chartex" xmlns:cx3="http://schemas.microsoft.com/office/drawing/2016/5/9/chartex" xmlns:cx4="http://schemas.microsoft.com/office/drawing/2016/5/10/chartex" xmlns:cx5="http://schemas.microsoft.com/office/drawing/2016/5/11/chartex" xmlns:cx6="http://schemas.microsoft.com/office/drawing/2016/5/12/chartex" xmlns:cx7="http://schemas.microsoft.com/office/drawing/2016/5/13/chartex" xmlns:cx8="http://schemas.microsoft.com/office/drawing/2016/5/14/chartex" xmlns:mc="http://schemas.openxmlformats.org/markup-compatibility/2006" xmlns:aink="http://schemas.microsoft.com/office/drawing/2016/ink" xmlns:am3d="http://schemas.microsoft.com/office/drawing/2017/model3d" xmlns:o="urn:schemas-microsoft-com:office:office" xmlns:oel="http://schemas.microsoft.com/office/2019/extlst" xmlns:r="http://schemas.openxmlformats.org/officeDocument/2006/relationships" xmlns:m="http://schemas.openxmlformats.org/officeDocument/2006/math" xmlns:v="urn:schemas-microsoft-com:vml" xmlns:wp14="http://schemas.microsoft.com/office/word/2010/wordprocessingDrawing" xmlns:wp="http://schemas.openxmlformats.org/drawingml/2006/wordprocessingDrawing" xmlns:w10="urn:schemas-microsoft-com:office:word" xmlns:w="http://schemas.openxmlformats.org/wordprocessingml/2006/main" xmlns:w14="http://schemas.microsoft.com/office/word/2010/wordml" xmlns:w15="http://schemas.microsoft.com/office/word/2012/wordml" xmlns:w16cex="http://schemas.microsoft.com/office/word/2018/wordml/cex" xmlns:w16cid="http://schemas.microsoft.com/office/word/2016/wordml/cid" xmlns:w16="http://schemas.microsoft.com/office/word/2018/wordml" xmlns:w16sdtdh="http://schemas.microsoft.com/office/word/2020/wordml/sdtdatahash" xmlns:w16se="http://schemas.microsoft.com/office/word/2015/wordml/symex" xmlns:wpg="http://schemas.microsoft.com/office/word/2010/wordprocessingGroup" xmlns:wpi="http://schemas.microsoft.com/office/word/2010/wordprocessingInk" xmlns:wne="http://schemas.microsoft.com/office/word/2006/wordml" xmlns:wps="http://schemas.microsoft.com/office/word/2010/wordprocessingShape" mc:Ignorable="w14 w15 w16se w16cid w16 w16cex w16sdtdh wp14">
+  <w:abstractNum w:abstractNumId="0" w15:restartNumberingAfterBreak="0">
+    <w:nsid w:val="7327627E"/>
+    <w:multiLevelType w:val="multilevel"/>
+    <w:tmpl w:val="7B9CB6C4"/>
+    <w:lvl w:ilvl="0">
+      <w:start w:val="1"/>
+      <w:numFmt w:val="bullet"/>
+      <w:lvlText w:val=""/>
+      <w:lvlJc w:val="left"/>
+      <w:pPr>
+        <w:tabs>
+          <w:tab w:val="num" w:pos="720"/>
+        </w:tabs>
+        <w:ind w:left="720" w:hanging="360"/>
+      </w:pPr>
+      <w:rPr>
+        <w:rFonts w:ascii="Symbol" w:hAnsi="Symbol" w:hint="default"/>
+        <w:sz w:val="20"/>
+      </w:rPr>
+    </w:lvl>
+    <w:lvl w:ilvl="1" w:tentative="1">
+      <w:start w:val="1"/>
+      <w:numFmt w:val="bullet"/>
+      <w:lvlText w:val="o"/>
+      <w:lvlJc w:val="left"/>
+      <w:pPr>
+        <w:tabs>
+          <w:tab w:val="num" w:pos="1440"/>
+        </w:tabs>
+        <w:ind w:left="1440" w:hanging="360"/>
+      </w:pPr>
+      <w:rPr>
+        <w:rFonts w:ascii="Courier New" w:hAnsi="Courier New" w:hint="default"/>
+        <w:sz w:val="20"/>
+      </w:rPr>
+    </w:lvl>
+    <w:lvl w:ilvl="2" w:tentative="1">
+      <w:start w:val="1"/>
+      <w:numFmt w:val="bullet"/>
+      <w:lvlText w:val=""/>
+      <w:lvlJc w:val="left"/>
+      <w:pPr>
+        <w:tabs>
+          <w:tab w:val="num" w:pos="2160"/>
+        </w:tabs>
+        <w:ind w:left="2160" w:hanging="360"/>
+      </w:pPr>
+      <w:rPr>
+        <w:rFonts w:ascii="Wingdings" w:hAnsi="Wingdings" w:hint="default"/>
+        <w:sz w:val="20"/>
+      </w:rPr>
+    </w:lvl>
+    <w:lvl w:ilvl="3" w:tentative="1">
+      <w:start w:val="1"/>
+      <w:numFmt w:val="bullet"/>
+      <w:lvlText w:val=""/>
+      <w:lvlJc w:val="left"/>
+      <w:pPr>
+        <w:tabs>
+          <w:tab w:val="num" w:pos="2880"/>
+        </w:tabs>
+        <w:ind w:left="2880" w:hanging="360"/>
+      </w:pPr>
+      <w:rPr>
+        <w:rFonts w:ascii="Wingdings" w:hAnsi="Wingdings" w:hint="default"/>
+        <w:sz w:val="20"/>
+      </w:rPr>
+    </w:lvl>
+    <w:lvl w:ilvl="4" w:tentative="1">
+      <w:start w:val="1"/>
+      <w:numFmt w:val="bullet"/>
+      <w:lvlText w:val=""/>
+      <w:lvlJc w:val="left"/>
+      <w:pPr>
+        <w:tabs>
+          <w:tab w:val="num" w:pos="3600"/>
+        </w:tabs>
+        <w:ind w:left="3600" w:hanging="360"/>
+      </w:pPr>
+      <w:rPr>
+        <w:rFonts w:ascii="Wingdings" w:hAnsi="Wingdings" w:hint="default"/>
+        <w:sz w:val="20"/>
+      </w:rPr>
+    </w:lvl>
+    <w:lvl w:ilvl="5" w:tentative="1">
+      <w:start w:val="1"/>
+      <w:numFmt w:val="bullet"/>
+      <w:lvlText w:val=""/>
+      <w:lvlJc w:val="left"/>
+      <w:pPr>
+        <w:tabs>
+          <w:tab w:val="num" w:pos="4320"/>
+        </w:tabs>
+        <w:ind w:left="4320" w:hanging="360"/>
+      </w:pPr>
+      <w:rPr>
+        <w:rFonts w:ascii="Wingdings" w:hAnsi="Wingdings" w:hint="default"/>
+        <w:sz w:val="20"/>
+      </w:rPr>
+    </w:lvl>
+    <w:lvl w:ilvl="6" w:tentative="1">
+      <w:start w:val="1"/>
+      <w:numFmt w:val="bullet"/>
+      <w:lvlText w:val=""/>
+      <w:lvlJc w:val="left"/>
+      <w:pPr>
+        <w:tabs>
+          <w:tab w:val="num" w:pos="5040"/>
+        </w:tabs>
+        <w:ind w:left="5040" w:hanging="360"/>
+      </w:pPr>
+      <w:rPr>
+        <w:rFonts w:ascii="Wingdings" w:hAnsi="Wingdings" w:hint="default"/>
+        <w:sz w:val="20"/>
+      </w:rPr>
+    </w:lvl>
+    <w:lvl w:ilvl="7" w:tentative="1">
+      <w:start w:val="1"/>
+      <w:numFmt w:val="bullet"/>
+      <w:lvlText w:val=""/>
+      <w:lvlJc w:val="left"/>
+      <w:pPr>
+        <w:tabs>
+          <w:tab w:val="num" w:pos="5760"/>
+        </w:tabs>
+        <w:ind w:left="5760" w:hanging="360"/>
+      </w:pPr>
+      <w:rPr>
+        <w:rFonts w:ascii="Wingdings" w:hAnsi="Wingdings" w:hint="default"/>
+        <w:sz w:val="20"/>
+      </w:rPr>
+    </w:lvl>
+    <w:lvl w:ilvl="8" w:tentative="1">
+      <w:start w:val="1"/>
+      <w:numFmt w:val="bullet"/>
+      <w:lvlText w:val=""/>
+      <w:lvlJc w:val="left"/>
+      <w:pPr>
+        <w:tabs>
+          <w:tab w:val="num" w:pos="6480"/>
+        </w:tabs>
+        <w:ind w:left="6480" w:hanging="360"/>
+      </w:pPr>
+      <w:rPr>
+        <w:rFonts w:ascii="Wingdings" w:hAnsi="Wingdings" w:hint="default"/>
+        <w:sz w:val="20"/>
+      </w:rPr>
+    </w:lvl>
+  </w:abstractNum>
+  <w:num w:numId="1" w16cid:durableId="2059932379">
+    <w:abstractNumId w:val="0"/>
+  </w:num>
+</w:numbering>
 </file>
 
 <file path=word/styles.xml><?xml version="1.0" encoding="utf-8"?>

</xml_diff>